<commit_message>
Cronograma de sprints y ajuste de épicas/sprints en el detalle de HU
Co-Authored-By: Claude Opus 5.5 <noreply@anthropic.com>
Claude-Session: https://claude.ai/code/session_01L6AZAxbeADdVhSetbZpUi6
</commit_message>
<xml_diff>
--- a/docs/historias-usuario/detalle-historias-usuario.docx
+++ b/docs/historias-usuario/detalle-historias-usuario.docx
@@ -2360,7 +2360,7 @@
           <w:sz w:val="22"/>
           <w:szCs w:val="22"/>
         </w:rPr>
-        <w:t xml:space="preserve">Detalle de la HU03 Consulta, búsqueda, edición y eliminación de registros históricos – EPIC01 – SP2</w:t>
+        <w:t xml:space="preserve">Detalle de la HU03 Consulta, búsqueda, edición y eliminación de registros históricos – EPIC01 – SP1</w:t>
       </w:r>
     </w:p>
     <w:tbl>
@@ -3453,7 +3453,7 @@
           <w:sz w:val="22"/>
           <w:szCs w:val="22"/>
         </w:rPr>
-        <w:t xml:space="preserve">Detalle de la HU04 Consulta y selección de información histórica relacionada – EPIC01 – SP2</w:t>
+        <w:t xml:space="preserve">Detalle de la HU04 Consulta y selección de información histórica relacionada – EPIC02 – SP2</w:t>
       </w:r>
     </w:p>
     <w:tbl>
@@ -4545,7 +4545,7 @@
           <w:sz w:val="22"/>
           <w:szCs w:val="22"/>
         </w:rPr>
-        <w:t xml:space="preserve">Detalle de la HU05 Generación de casos de prueba funcionales mediante LLM – EPIC02 – SP3</w:t>
+        <w:t xml:space="preserve">Detalle de la HU05 Generación de casos de prueba funcionales mediante LLM – EPIC02 – SP2</w:t>
       </w:r>
     </w:p>
     <w:tbl>
@@ -5672,7 +5672,7 @@
           <w:sz w:val="22"/>
           <w:szCs w:val="22"/>
         </w:rPr>
-        <w:t xml:space="preserve">Detalle de la HU06 Revisión de casos generados y registro de observaciones – EPIC03 – SP4</w:t>
+        <w:t xml:space="preserve">Detalle de la HU06 Revisión de casos generados y registro de observaciones – EPIC03 – SP3</w:t>
       </w:r>
     </w:p>
     <w:tbl>
@@ -6746,7 +6746,7 @@
           <w:sz w:val="22"/>
           <w:szCs w:val="22"/>
         </w:rPr>
-        <w:t xml:space="preserve">Detalle de la HU07 Regeneración de casos de prueba según observaciones – EPIC03 – SP4</w:t>
+        <w:t xml:space="preserve">Detalle de la HU07 Regeneración de casos de prueba según observaciones – EPIC03 – SP3</w:t>
       </w:r>
     </w:p>
     <w:tbl>
@@ -7766,7 +7766,7 @@
           <w:sz w:val="22"/>
           <w:szCs w:val="22"/>
         </w:rPr>
-        <w:t xml:space="preserve">Detalle de la HU08 Envío de casos revisados para aprobación – EPIC04 – SP5</w:t>
+        <w:t xml:space="preserve">Detalle de la HU08 Envío de casos revisados para aprobación – EPIC04 – SP3</w:t>
       </w:r>
     </w:p>
     <w:tbl>
@@ -8767,7 +8767,7 @@
           <w:sz w:val="22"/>
           <w:szCs w:val="22"/>
         </w:rPr>
-        <w:t xml:space="preserve">Detalle de la HU09 Aprobación o devolución de casos de prueba – EPIC04 – SP5</w:t>
+        <w:t xml:space="preserve">Detalle de la HU09 Aprobación o devolución de casos de prueba – EPIC04 – SP4</w:t>
       </w:r>
     </w:p>
     <w:tbl>
@@ -9823,7 +9823,7 @@
           <w:sz w:val="22"/>
           <w:szCs w:val="22"/>
         </w:rPr>
-        <w:t xml:space="preserve">Detalle de la HU10 Exportación de casos de prueba aprobados a Excel – EPIC04 – SP5</w:t>
+        <w:t xml:space="preserve">Detalle de la HU10 Exportación de casos de prueba aprobados a Excel – EPIC04 – SP4</w:t>
       </w:r>
     </w:p>
     <w:tbl>
@@ -10968,7 +10968,7 @@
           <w:sz w:val="22"/>
           <w:szCs w:val="22"/>
         </w:rPr>
-        <w:t xml:space="preserve">Detalle de la HU11 Consulta de reportes de casos de prueba por estado – EPIC05 – SP6</w:t>
+        <w:t xml:space="preserve">Detalle de la HU11 Consulta de reportes de casos de prueba por estado – EPIC05 – SP4</w:t>
       </w:r>
     </w:p>
     <w:tbl>
@@ -12023,7 +12023,7 @@
           <w:sz w:val="22"/>
           <w:szCs w:val="22"/>
         </w:rPr>
-        <w:t xml:space="preserve">Detalle de la HU12 Consulta de reporte de cobertura de escenarios – EPIC05 – SP6</w:t>
+        <w:t xml:space="preserve">Detalle de la HU12 Consulta de reporte de cobertura de escenarios – EPIC05 – SP4</w:t>
       </w:r>
     </w:p>
     <w:tbl>

</xml_diff>